<commit_message>
Cap 18 enriquecido: las cinco islas del banco (experiencia directa)
- libro/manuscrito/18_banco.md: nueva sección "La realidad operativa: cinco
  islas que nadie consolida". Aterriza la fragmentación típica de una
  financiera mediana antes de presentar el modelado:
  - Isla 1: central Linux con core relacional
  - Isla 2: agencias con software propietario, simuladores, aprobación express
  - Isla 3: contabilidad en Excel + sistemas a medida + VB legacy
  - Isla 4: promotores y red comercial con tablas planas
  - Isla 5: reporting con ETLs ad-hoc y proyectos de 1-3 meses
  El argumento: centralizar tradicionalmente exige que todas hablen el
  mismo schema (imposible). WQuestions exige solo que cada una publique
  sus hechos al grafo con su dialecto, mapeado a D7 una vez. Las islas
  siguen siendo islas; el archipiélago se vuelve consultable.

- libro/diagrams/src/43_cinco_islas_banco.py: 5 islas con su tecnología
  y vocabulario, convergiendo al grafo común.
</commit_message>
<xml_diff>
--- a/libro/docx/18_banco.docx
+++ b/libro/docx/18_banco.docx
@@ -165,7 +165,7 @@
         <w:pStyle w:val="Heading2"/>
       </w:pPr>
       <w:r>
-        <w:t>Un mapa del dominio</w:t>
+        <w:t>La realidad operativa: cinco islas que nadie consolida</w:t>
       </w:r>
     </w:p>
     <w:p>
@@ -175,7 +175,7 @@
           <w:i w:val="0"/>
           <w:u w:val="none"/>
         </w:rPr>
-        <w:t xml:space="preserve">Lo primero al abordar un banco es resistir la urgencia de bajar a detalle. El alto nivel importa porque el banco tiene </w:t>
+        <w:t xml:space="preserve">Antes de meternos en el modelado conviene describir, sin maquillaje, </w:t>
       </w:r>
       <w:r>
         <w:rPr>
@@ -183,7 +183,7 @@
           <w:i w:val="0"/>
           <w:u w:val="none"/>
         </w:rPr>
-        <w:t>muchas familias de entidades a la vez</w:t>
+        <w:t>cómo se ve un banco regional por dentro</w:t>
       </w:r>
       <w:r>
         <w:rPr>
@@ -191,7 +191,7 @@
           <w:i w:val="0"/>
           <w:u w:val="none"/>
         </w:rPr>
-        <w:t>:</w:t>
+        <w:t>. Es probable que el lector que haya trabajado en uno reconozca el cuadro; quien venga de otros sectores se sorprenda. Lo que sigue no es un escenario hipotético: es el patrón típico de financieras medianas en cualquier país de habla hispana, descrito desde la experiencia directa.</w:t>
       </w:r>
     </w:p>
     <w:p>
@@ -201,7 +201,7 @@
           <w:i w:val="0"/>
           <w:u w:val="none"/>
         </w:rPr>
-        <w:t>Q — agentes.</w:t>
+        <w:t>Isla 1 — La central.</w:t>
       </w:r>
       <w:r>
         <w:rPr>
@@ -209,7 +209,23 @@
           <w:i w:val="0"/>
           <w:u w:val="none"/>
         </w:rPr>
-        <w:t xml:space="preserve"> Tres clases bien distintas. (1) Personas físicas: clientes retail, empleados, ejecutivos de cuenta. (2) Personas jurídicas: empresas clientes, corresponsales, regulador, procesadores (Visa, Mastercard), partners. (3) Sistemas con agencia (D5): el motor de scoring, el sistema antifraude, los autorizadores de tarjeta, los robots de cobranza. Los tres tipos entran a Q sin distinción especial — el modelo trata uniformemente a un humano y a un autorizador automático.</w:t>
+        <w:t xml:space="preserve"> Un servidor en casa matriz corre el </w:t>
+      </w:r>
+      <w:r>
+        <w:rPr>
+          <w:b w:val="0"/>
+          <w:i/>
+          <w:u w:val="none"/>
+        </w:rPr>
+        <w:t>core bancario</w:t>
+      </w:r>
+      <w:r>
+        <w:rPr>
+          <w:b w:val="0"/>
+          <w:i w:val="0"/>
+          <w:u w:val="none"/>
+        </w:rPr>
+        <w:t xml:space="preserve"> sobre Linux. Una base de datos relacional grande, un montón de stored procedures, una capa de servicios que las agencias y los canales digitales consumen. Esta isla es la "verdad oficial" — cuentas, saldos, movimientos, asientos contables. Es la que el regulador audita cuando viene a inspeccionar.</w:t>
       </w:r>
     </w:p>
     <w:p>
@@ -219,7 +235,7 @@
           <w:i w:val="0"/>
           <w:u w:val="none"/>
         </w:rPr>
-        <w:t>O — entidades situadas.</w:t>
+        <w:t>Isla 2 — Las agencias.</w:t>
       </w:r>
       <w:r>
         <w:rPr>
@@ -227,7 +243,221 @@
           <w:i w:val="0"/>
           <w:u w:val="none"/>
         </w:rPr>
-        <w:t xml:space="preserve"> Acá está el grueso del dominio. (1) Cuentas: corrientes, ahorros, plazo fijo, cuenta sueldo, cuenta corporativa, cuenta en moneda extranjera. (2) Productos crediticios: préstamos personales, hipotecarios, vehiculares, tarjetas de crédito, líneas comerciales, créditos por planilla. (3) Movimientos: cada depósito, retiro, transferencia, pago, cargo, abono. (4) Asientos contables: cada movimiento operativo tiene su contrapartida en cuentas de balance. (5) Productos como ofertas reificadas: </w:t>
+        <w:t xml:space="preserve"> Cada sucursal — o al menos las grandes — tiene </w:t>
+      </w:r>
+      <w:r>
+        <w:rPr>
+          <w:b/>
+          <w:i w:val="0"/>
+          <w:u w:val="none"/>
+        </w:rPr>
+        <w:t>software propietario</w:t>
+      </w:r>
+      <w:r>
+        <w:rPr>
+          <w:b w:val="0"/>
+          <w:i w:val="0"/>
+          <w:u w:val="none"/>
+        </w:rPr>
+        <w:t xml:space="preserve"> para tareas que el core no resuelve bien: simuladores de tasa, motores de aprobación de créditos express, hojas de cálculo del ejecutivo de cuenta, sistemas de turnos. Algunos vienen con el ERP, otros los compró el banco a un proveedor local, otros los hizo un programador del banco hace doce años y nadie sabe quién ya. Estos sistemas </w:t>
+      </w:r>
+      <w:r>
+        <w:rPr>
+          <w:b/>
+          <w:i w:val="0"/>
+          <w:u w:val="none"/>
+        </w:rPr>
+        <w:t>calculan</w:t>
+      </w:r>
+      <w:r>
+        <w:rPr>
+          <w:b w:val="0"/>
+          <w:i w:val="0"/>
+          <w:u w:val="none"/>
+        </w:rPr>
+        <w:t xml:space="preserve">, </w:t>
+      </w:r>
+      <w:r>
+        <w:rPr>
+          <w:b/>
+          <w:i w:val="0"/>
+          <w:u w:val="none"/>
+        </w:rPr>
+        <w:t>deciden</w:t>
+      </w:r>
+      <w:r>
+        <w:rPr>
+          <w:b w:val="0"/>
+          <w:i w:val="0"/>
+          <w:u w:val="none"/>
+        </w:rPr>
+        <w:t xml:space="preserve"> y </w:t>
+      </w:r>
+      <w:r>
+        <w:rPr>
+          <w:b/>
+          <w:i w:val="0"/>
+          <w:u w:val="none"/>
+        </w:rPr>
+        <w:t>aprueban</w:t>
+      </w:r>
+      <w:r>
+        <w:rPr>
+          <w:b w:val="0"/>
+          <w:i w:val="0"/>
+          <w:u w:val="none"/>
+        </w:rPr>
+        <w:t>, pero rara vez devuelven al core la trazabilidad de cómo llegaron a la decisión.</w:t>
+      </w:r>
+    </w:p>
+    <w:p>
+      <w:r>
+        <w:rPr>
+          <w:b/>
+          <w:i w:val="0"/>
+          <w:u w:val="none"/>
+        </w:rPr>
+        <w:t>Isla 3 — Contabilidad.</w:t>
+      </w:r>
+      <w:r>
+        <w:rPr>
+          <w:b w:val="0"/>
+          <w:i w:val="0"/>
+          <w:u w:val="none"/>
+        </w:rPr>
+        <w:t xml:space="preserve"> Aquí el zoológico se vuelve evidente. Una parte vive en el core (los asientos automáticos generados por cada operación). Otra parte vive en </w:t>
+      </w:r>
+      <w:r>
+        <w:rPr>
+          <w:b/>
+          <w:i w:val="0"/>
+          <w:u w:val="none"/>
+        </w:rPr>
+        <w:t>Excel</w:t>
+      </w:r>
+      <w:r>
+        <w:rPr>
+          <w:b w:val="0"/>
+          <w:i w:val="0"/>
+          <w:u w:val="none"/>
+        </w:rPr>
+        <w:t xml:space="preserve"> — los ajustes manuales, los movimientos extraordinarios, las correcciones de fin de mes. Otra parte vive en </w:t>
+      </w:r>
+      <w:r>
+        <w:rPr>
+          <w:b/>
+          <w:i w:val="0"/>
+          <w:u w:val="none"/>
+        </w:rPr>
+        <w:t>sistemas hechos a medida</w:t>
+      </w:r>
+      <w:r>
+        <w:rPr>
+          <w:b w:val="0"/>
+          <w:i w:val="0"/>
+          <w:u w:val="none"/>
+        </w:rPr>
+        <w:t xml:space="preserve"> por el área financiera: un módulo para conciliación con corresponsales, una hoja con macros para el reporte regulatorio, un programa Visual Basic que hace el cierre mensual. Cuando hay diferencia entre lo que dice el core y lo que dice contabilidad, gana contabilidad — pero </w:t>
+      </w:r>
+      <w:r>
+        <w:rPr>
+          <w:b/>
+          <w:i w:val="0"/>
+          <w:u w:val="none"/>
+        </w:rPr>
+        <w:t>explicar la diferencia</w:t>
+      </w:r>
+      <w:r>
+        <w:rPr>
+          <w:b w:val="0"/>
+          <w:i w:val="0"/>
+          <w:u w:val="none"/>
+        </w:rPr>
+        <w:t xml:space="preserve"> lleva días.</w:t>
+      </w:r>
+    </w:p>
+    <w:p>
+      <w:r>
+        <w:rPr>
+          <w:b/>
+          <w:i w:val="0"/>
+          <w:u w:val="none"/>
+        </w:rPr>
+        <w:t>Isla 4 — Los promotores y la red comercial.</w:t>
+      </w:r>
+      <w:r>
+        <w:rPr>
+          <w:b w:val="0"/>
+          <w:i w:val="0"/>
+          <w:u w:val="none"/>
+        </w:rPr>
+        <w:t xml:space="preserve"> Los promotores externos que originan créditos a domicilio, los corresponsales no bancarios, los puntos de pago tercerizados — todos manejan información del cliente que </w:t>
+      </w:r>
+      <w:r>
+        <w:rPr>
+          <w:b/>
+          <w:i w:val="0"/>
+          <w:u w:val="none"/>
+        </w:rPr>
+        <w:t>no entra al core hasta el momento del desembolso</w:t>
+      </w:r>
+      <w:r>
+        <w:rPr>
+          <w:b w:val="0"/>
+          <w:i w:val="0"/>
+          <w:u w:val="none"/>
+        </w:rPr>
+        <w:t xml:space="preserve">. En el camino vive en </w:t>
+      </w:r>
+      <w:r>
+        <w:rPr>
+          <w:b/>
+          <w:i w:val="0"/>
+          <w:u w:val="none"/>
+        </w:rPr>
+        <w:t>tablas planas</w:t>
+      </w:r>
+      <w:r>
+        <w:rPr>
+          <w:b w:val="0"/>
+          <w:i w:val="0"/>
+          <w:u w:val="none"/>
+        </w:rPr>
+        <w:t>: planillas Excel, formularios PDF, archivos CSV que se cargan al final del día por lotes. La promesa de un crédito que se le hizo a un cliente el lunes, si la operación cae el viernes, generó cuatro días de información volátil que el sistema central nunca vio.</w:t>
+      </w:r>
+    </w:p>
+    <w:p>
+      <w:r>
+        <w:rPr>
+          <w:b/>
+          <w:i w:val="0"/>
+          <w:u w:val="none"/>
+        </w:rPr>
+        <w:t>Isla 5 — Los reportes y el regulatorio.</w:t>
+      </w:r>
+      <w:r>
+        <w:rPr>
+          <w:b w:val="0"/>
+          <w:i w:val="0"/>
+          <w:u w:val="none"/>
+        </w:rPr>
+        <w:t xml:space="preserve"> Cada vez que alguien — un comité, un regulador, un auditor — pide un reporte que cruza dos o más islas, se activa un proyecto. Se forma un equipo, se diseña una </w:t>
+      </w:r>
+      <w:r>
+        <w:rPr>
+          <w:b/>
+          <w:i w:val="0"/>
+          <w:u w:val="none"/>
+        </w:rPr>
+        <w:t>ETL</w:t>
+      </w:r>
+      <w:r>
+        <w:rPr>
+          <w:b w:val="0"/>
+          <w:i w:val="0"/>
+          <w:u w:val="none"/>
+        </w:rPr>
+        <w:t xml:space="preserve"> (extract-transform-load) que extrae de cada fuente, se construye un </w:t>
       </w:r>
       <w:r>
         <w:rPr>
@@ -235,7 +465,7 @@
           <w:i/>
           <w:u w:val="none"/>
         </w:rPr>
-        <w:t>"Tarjeta Visa Platinum"</w:t>
+        <w:t>data warehouse</w:t>
       </w:r>
       <w:r>
         <w:rPr>
@@ -243,7 +473,7 @@
           <w:i w:val="0"/>
           <w:u w:val="none"/>
         </w:rPr>
-        <w:t xml:space="preserve">, </w:t>
+        <w:t xml:space="preserve"> o un </w:t>
       </w:r>
       <w:r>
         <w:rPr>
@@ -251,7 +481,7 @@
           <w:i/>
           <w:u w:val="none"/>
         </w:rPr>
-        <w:t>"Préstamo Hipotecario Tasa Fija 15 años"</w:t>
+        <w:t>data lake</w:t>
       </w:r>
       <w:r>
         <w:rPr>
@@ -259,17 +489,41 @@
           <w:i w:val="0"/>
           <w:u w:val="none"/>
         </w:rPr>
-        <w:t xml:space="preserve"> — son entidades del catálogo comercial del banco, no categorías abstractas. (6) Investigaciones de fraude, reclamos, gestiones de cobranza, ajustes contables.</w:t>
+        <w:t xml:space="preserve"> o un </w:t>
+      </w:r>
+      <w:r>
+        <w:rPr>
+          <w:b w:val="0"/>
+          <w:i/>
+          <w:u w:val="none"/>
+        </w:rPr>
+        <w:t>data mart</w:t>
+      </w:r>
+      <w:r>
+        <w:rPr>
+          <w:b w:val="0"/>
+          <w:i w:val="0"/>
+          <w:u w:val="none"/>
+        </w:rPr>
+        <w:t xml:space="preserve"> según la moda del año, se consolida, se reconcilia, se publica. Dos semanas mínimo, un mes habitual, tres meses cuando se descubre que las dos fuentes no coinciden y hay que entender por qué.</w:t>
       </w:r>
     </w:p>
     <w:p>
+      <w:r>
+        <w:rPr>
+          <w:b w:val="0"/>
+          <w:i w:val="0"/>
+          <w:u w:val="none"/>
+        </w:rPr>
+        <w:t xml:space="preserve">Este es el cuadro. </w:t>
+      </w:r>
       <w:r>
         <w:rPr>
           <w:b/>
           <w:i w:val="0"/>
           <w:u w:val="none"/>
         </w:rPr>
-        <w:t>L — lugares.</w:t>
+        <w:t>Cinco islas, gobernanzas distintas, vocabularios distintos, ritmos distintos, calidades distintas.</w:t>
       </w:r>
       <w:r>
         <w:rPr>
@@ -277,7 +531,7 @@
           <w:i w:val="0"/>
           <w:u w:val="none"/>
         </w:rPr>
-        <w:t xml:space="preserve"> Sedes (casa matriz, sucursales urbanas, agencias del interior), ATMs, canales digitales (web banking, mobile, USSD), puntos de venta (POS) de la red. Cada operación tiene un canal — y eso es L. Un préstamo desembolsado en sucursal vs uno originado por web banking son operativamente distintos.</w:t>
+        <w:t xml:space="preserve"> Ninguna isla es desechable — cada una hace algo que las demás no — y sin embargo el negocio necesita verlas como un todo. Centralizar es una pesadilla que cada banco intenta cada cinco años con resultados decepcionantes: el motor de consolidación nuevo se vuelve la sexta isla, y los proyectos de migración se prolongan tanto que cuando terminan el negocio ya cambió.</w:t>
       </w:r>
     </w:p>
     <w:p>
@@ -287,7 +541,7 @@
           <w:i w:val="0"/>
           <w:u w:val="none"/>
         </w:rPr>
-        <w:t>T — momentos.</w:t>
+        <w:t>¿Por qué pasa esto?</w:t>
       </w:r>
       <w:r>
         <w:rPr>
@@ -295,17 +549,15 @@
           <w:i w:val="0"/>
           <w:u w:val="none"/>
         </w:rPr>
-        <w:t xml:space="preserve"> Triple registro: el momento del evento operativo (cuándo ocurrió la transacción en la realidad), el momento del registro contable (cuándo se asentó), el momento de cierre (cuándo se cerró el período). La diferencia entre los tres es lo que la auditoría interna persigue.</w:t>
-      </w:r>
-    </w:p>
-    <w:p>
+        <w:t xml:space="preserve"> No porque los bancos sean tontos. Pasa porque la centralización tradicional exige que </w:t>
+      </w:r>
       <w:r>
         <w:rPr>
           <w:b/>
           <w:i w:val="0"/>
           <w:u w:val="none"/>
         </w:rPr>
-        <w:t>N — cantidades.</w:t>
+        <w:t>todas las islas hablen el mismo schema</w:t>
       </w:r>
       <w:r>
         <w:rPr>
@@ -313,7 +565,241 @@
           <w:i w:val="0"/>
           <w:u w:val="none"/>
         </w:rPr>
-        <w:t xml:space="preserve"> Importes en distintas monedas, tasas, plazos, scores de riesgo. Cada N con su unidad K — y acá las unidades son críticas: confundir USD con EUR es el equivalente bancario al </w:t>
+        <w:t>, y obligar a un sistema legacy de doce años a hablar el schema del nuevo data lake es más caro que dejarlo como está y construir un puente. Multiplicado por cinco islas y cuarenta sistemas satélite, la suma se vuelve política antes que técnica.</w:t>
+      </w:r>
+    </w:p>
+    <w:p>
+      <w:r>
+        <w:rPr>
+          <w:b/>
+          <w:i w:val="0"/>
+          <w:u w:val="none"/>
+        </w:rPr>
+        <w:t>WQuestions cambia exactamente esto.</w:t>
+      </w:r>
+      <w:r>
+        <w:rPr>
+          <w:b w:val="0"/>
+          <w:i w:val="0"/>
+          <w:u w:val="none"/>
+        </w:rPr>
+        <w:t xml:space="preserve"> No exige que ningún sistema cambie su schema. Exige que cada sistema </w:t>
+      </w:r>
+      <w:r>
+        <w:rPr>
+          <w:b/>
+          <w:i w:val="0"/>
+          <w:u w:val="none"/>
+        </w:rPr>
+        <w:t>publique sus hechos</w:t>
+      </w:r>
+      <w:r>
+        <w:rPr>
+          <w:b w:val="0"/>
+          <w:i w:val="0"/>
+          <w:u w:val="none"/>
+        </w:rPr>
+        <w:t xml:space="preserve"> al grafo común con su propio dialecto de dominio, mapeado al catálogo D7 una sola vez. El core publica como core; las agencias publican como agencias; contabilidad publica como contabilidad; los promotores publican lo que tienen. Cada uno mantiene su vocabulario. La unificación ocurre en el catálogo, no en los sistemas:</w:t>
+      </w:r>
+    </w:p>
+    <w:p>
+      <w:pPr>
+        <w:ind w:left="432"/>
+      </w:pPr>
+      <w:r>
+        <w:rPr>
+          <w:rFonts w:ascii="Courier New" w:hAnsi="Courier New"/>
+          <w:sz w:val="18"/>
+        </w:rPr>
+        <w:t xml:space="preserve">ISLA 1 — core         habla: "cuenta_ahorros", "asiento"     </w:t>
+      </w:r>
+      <w:r>
+        <w:rPr>
+          <w:rFonts w:ascii="Cambria Math" w:hAnsi="Cambria Math"/>
+          <w:sz w:val="18"/>
+        </w:rPr>
+        <w:t>→</w:t>
+      </w:r>
+      <w:r>
+        <w:rPr>
+          <w:rFonts w:ascii="Courier New" w:hAnsi="Courier New"/>
+          <w:sz w:val="18"/>
+        </w:rPr>
+        <w:t xml:space="preserve"> mapeo D7</w:t>
+      </w:r>
+    </w:p>
+    <w:p>
+      <w:pPr>
+        <w:ind w:left="432"/>
+      </w:pPr>
+      <w:r>
+        <w:rPr>
+          <w:rFonts w:ascii="Courier New" w:hAnsi="Courier New"/>
+          <w:sz w:val="18"/>
+        </w:rPr>
+        <w:t xml:space="preserve">ISLA 2 — agencia      habla: "linea_credito", "simulacion"   </w:t>
+      </w:r>
+      <w:r>
+        <w:rPr>
+          <w:rFonts w:ascii="Cambria Math" w:hAnsi="Cambria Math"/>
+          <w:sz w:val="18"/>
+        </w:rPr>
+        <w:t>→</w:t>
+      </w:r>
+      <w:r>
+        <w:rPr>
+          <w:rFonts w:ascii="Courier New" w:hAnsi="Courier New"/>
+          <w:sz w:val="18"/>
+        </w:rPr>
+        <w:t xml:space="preserve"> mapeo D7</w:t>
+      </w:r>
+    </w:p>
+    <w:p>
+      <w:pPr>
+        <w:ind w:left="432"/>
+      </w:pPr>
+      <w:r>
+        <w:rPr>
+          <w:rFonts w:ascii="Courier New" w:hAnsi="Courier New"/>
+          <w:sz w:val="18"/>
+        </w:rPr>
+        <w:t xml:space="preserve">ISLA 3 — contabilidad habla: "ajuste_mensual", "partida"     </w:t>
+      </w:r>
+      <w:r>
+        <w:rPr>
+          <w:rFonts w:ascii="Cambria Math" w:hAnsi="Cambria Math"/>
+          <w:sz w:val="18"/>
+        </w:rPr>
+        <w:t>→</w:t>
+      </w:r>
+      <w:r>
+        <w:rPr>
+          <w:rFonts w:ascii="Courier New" w:hAnsi="Courier New"/>
+          <w:sz w:val="18"/>
+        </w:rPr>
+        <w:t xml:space="preserve"> mapeo D7</w:t>
+      </w:r>
+    </w:p>
+    <w:p>
+      <w:pPr>
+        <w:ind w:left="432"/>
+      </w:pPr>
+      <w:r>
+        <w:rPr>
+          <w:rFonts w:ascii="Courier New" w:hAnsi="Courier New"/>
+          <w:sz w:val="18"/>
+        </w:rPr>
+        <w:t xml:space="preserve">ISLA 4 — promotor     habla: "prospecto", "promesa"          </w:t>
+      </w:r>
+      <w:r>
+        <w:rPr>
+          <w:rFonts w:ascii="Cambria Math" w:hAnsi="Cambria Math"/>
+          <w:sz w:val="18"/>
+        </w:rPr>
+        <w:t>→</w:t>
+      </w:r>
+      <w:r>
+        <w:rPr>
+          <w:rFonts w:ascii="Courier New" w:hAnsi="Courier New"/>
+          <w:sz w:val="18"/>
+        </w:rPr>
+        <w:t xml:space="preserve"> mapeo D7</w:t>
+      </w:r>
+    </w:p>
+    <w:p>
+      <w:pPr>
+        <w:ind w:left="432"/>
+      </w:pPr>
+      <w:r>
+        <w:rPr>
+          <w:rFonts w:ascii="Courier New" w:hAnsi="Courier New"/>
+          <w:sz w:val="18"/>
+        </w:rPr>
+        <w:t xml:space="preserve">ISLA 5 — reporting    habla: "indicador", "snapshot"         </w:t>
+      </w:r>
+      <w:r>
+        <w:rPr>
+          <w:rFonts w:ascii="Cambria Math" w:hAnsi="Cambria Math"/>
+          <w:sz w:val="18"/>
+        </w:rPr>
+        <w:t>→</w:t>
+      </w:r>
+      <w:r>
+        <w:rPr>
+          <w:rFonts w:ascii="Courier New" w:hAnsi="Courier New"/>
+          <w:sz w:val="18"/>
+        </w:rPr>
+        <w:t xml:space="preserve"> mapeo D7</w:t>
+      </w:r>
+    </w:p>
+    <w:p>
+      <w:pPr>
+        <w:ind w:left="432"/>
+      </w:pPr>
+      <w:r>
+        <w:rPr>
+          <w:rFonts w:ascii="Courier New" w:hAnsi="Courier New"/>
+          <w:sz w:val="18"/>
+        </w:rPr>
+        <w:t xml:space="preserve">                                                                    ↓</w:t>
+      </w:r>
+    </w:p>
+    <w:p>
+      <w:pPr>
+        <w:ind w:left="432"/>
+      </w:pPr>
+      <w:r>
+        <w:rPr>
+          <w:rFonts w:ascii="Courier New" w:hAnsi="Courier New"/>
+          <w:sz w:val="18"/>
+        </w:rPr>
+        <w:t xml:space="preserve">                                                       ┌────────────┐</w:t>
+      </w:r>
+    </w:p>
+    <w:p>
+      <w:pPr>
+        <w:ind w:left="432"/>
+      </w:pPr>
+      <w:r>
+        <w:rPr>
+          <w:rFonts w:ascii="Courier New" w:hAnsi="Courier New"/>
+          <w:sz w:val="18"/>
+        </w:rPr>
+        <w:t xml:space="preserve">                                                       │ grafo común │</w:t>
+      </w:r>
+    </w:p>
+    <w:p>
+      <w:pPr>
+        <w:ind w:left="432"/>
+      </w:pPr>
+      <w:r>
+        <w:rPr>
+          <w:rFonts w:ascii="Courier New" w:hAnsi="Courier New"/>
+          <w:sz w:val="18"/>
+        </w:rPr>
+        <w:t xml:space="preserve">                                                       │ WQuestions  │</w:t>
+      </w:r>
+    </w:p>
+    <w:p>
+      <w:pPr>
+        <w:ind w:left="432"/>
+      </w:pPr>
+      <w:r>
+        <w:rPr>
+          <w:rFonts w:ascii="Courier New" w:hAnsi="Courier New"/>
+          <w:sz w:val="18"/>
+        </w:rPr>
+        <w:t xml:space="preserve">                                                       └────────────┘</w:t>
+      </w:r>
+    </w:p>
+    <w:p>
+      <w:r>
+        <w:rPr>
+          <w:b w:val="0"/>
+          <w:i w:val="0"/>
+          <w:u w:val="none"/>
+        </w:rPr>
+        <w:t xml:space="preserve">Los reportes cross-isla — que hoy son proyectos de tres meses — se vuelven consultas. </w:t>
       </w:r>
       <w:r>
         <w:rPr>
@@ -321,7 +807,7 @@
           <w:i/>
           <w:u w:val="none"/>
         </w:rPr>
-        <w:t>Mars Climate Orbiter</w:t>
+        <w:t>"¿Cuántas operaciones aprobadas en agencias entre lunes y viernes terminaron asentándose en el core el lunes siguiente?"</w:t>
       </w:r>
       <w:r>
         <w:rPr>
@@ -329,17 +815,77 @@
           <w:i w:val="0"/>
           <w:u w:val="none"/>
         </w:rPr>
-        <w:t xml:space="preserve"> citado en el capítulo 6.</w:t>
+        <w:t xml:space="preserve"> es una pregunta directa contra el grafo: filtra por situación de tipo </w:t>
+      </w:r>
+      <w:r>
+        <w:rPr>
+          <w:b w:val="0"/>
+          <w:i/>
+          <w:u w:val="none"/>
+        </w:rPr>
+        <w:t>aprobación</w:t>
+      </w:r>
+      <w:r>
+        <w:rPr>
+          <w:b w:val="0"/>
+          <w:i w:val="0"/>
+          <w:u w:val="none"/>
+        </w:rPr>
+        <w:t xml:space="preserve"> con </w:t>
+      </w:r>
+      <w:r>
+        <w:rPr>
+          <w:rFonts w:ascii="Courier New" w:hAnsi="Courier New"/>
+          <w:b w:val="0"/>
+          <w:i w:val="0"/>
+          <w:sz w:val="20"/>
+          <w:u w:val="none"/>
+        </w:rPr>
+        <w:t>lugar_de: agencia</w:t>
+      </w:r>
+      <w:r>
+        <w:rPr>
+          <w:b w:val="0"/>
+          <w:i w:val="0"/>
+          <w:u w:val="none"/>
+        </w:rPr>
+        <w:t xml:space="preserve"> y momento operativo en una semana, hace </w:t>
+      </w:r>
+      <w:r>
+        <w:rPr>
+          <w:rFonts w:ascii="Courier New" w:hAnsi="Courier New"/>
+          <w:b w:val="0"/>
+          <w:i w:val="0"/>
+          <w:sz w:val="20"/>
+          <w:u w:val="none"/>
+        </w:rPr>
+        <w:t>join</w:t>
+      </w:r>
+      <w:r>
+        <w:rPr>
+          <w:b w:val="0"/>
+          <w:i w:val="0"/>
+          <w:u w:val="none"/>
+        </w:rPr>
+        <w:t xml:space="preserve"> con asientos contables del lunes siguiente, devuelve el cruce.</w:t>
       </w:r>
     </w:p>
     <w:p>
+      <w:r>
+        <w:rPr>
+          <w:b w:val="0"/>
+          <w:i w:val="0"/>
+          <w:u w:val="none"/>
+        </w:rPr>
+        <w:t xml:space="preserve">Nada de esto exige reescribir las islas. Exige que cada una publique sus hechos atómicos — los que producen sus eventos significativos — al grafo. Una capa fina de </w:t>
+      </w:r>
       <w:r>
         <w:rPr>
           <w:b/>
           <w:i w:val="0"/>
           <w:u w:val="none"/>
         </w:rPr>
-        <w:t>K — categorías.</w:t>
+        <w:t>adaptación</w:t>
       </w:r>
       <w:r>
         <w:rPr>
@@ -347,6 +893,289 @@
           <w:i w:val="0"/>
           <w:u w:val="none"/>
         </w:rPr>
+        <w:t xml:space="preserve"> por sistema, escrita una vez. El resto sigue operando como está, con su propio software propietario, su Excel, su tabla plana. La diferencia es que ahora </w:t>
+      </w:r>
+      <w:r>
+        <w:rPr>
+          <w:b/>
+          <w:i w:val="0"/>
+          <w:u w:val="none"/>
+        </w:rPr>
+        <w:t>el grafo ve todo</w:t>
+      </w:r>
+      <w:r>
+        <w:rPr>
+          <w:b w:val="0"/>
+          <w:i w:val="0"/>
+          <w:u w:val="none"/>
+        </w:rPr>
+        <w:t>.</w:t>
+      </w:r>
+    </w:p>
+    <w:p>
+      <w:pPr>
+        <w:jc w:val="center"/>
+      </w:pPr>
+      <w:r>
+        <w:drawing>
+          <wp:inline xmlns:a="http://schemas.openxmlformats.org/drawingml/2006/main" xmlns:pic="http://schemas.openxmlformats.org/drawingml/2006/picture">
+            <wp:extent cx="5486400" cy="3484386"/>
+            <wp:docPr id="1" name="Picture 1"/>
+            <wp:cNvGraphicFramePr>
+              <a:graphicFrameLocks noChangeAspect="1"/>
+            </wp:cNvGraphicFramePr>
+            <a:graphic>
+              <a:graphicData uri="http://schemas.openxmlformats.org/drawingml/2006/picture">
+                <pic:pic>
+                  <pic:nvPicPr>
+                    <pic:cNvPr id="0" name="43_cinco_islas_banco.png"/>
+                    <pic:cNvPicPr/>
+                  </pic:nvPicPr>
+                  <pic:blipFill>
+                    <a:blip r:embed="rId9"/>
+                    <a:stretch>
+                      <a:fillRect/>
+                    </a:stretch>
+                  </pic:blipFill>
+                  <pic:spPr>
+                    <a:xfrm>
+                      <a:off x="0" y="0"/>
+                      <a:ext cx="5486400" cy="3484386"/>
+                    </a:xfrm>
+                    <a:prstGeom prst="rect"/>
+                  </pic:spPr>
+                </pic:pic>
+              </a:graphicData>
+            </a:graphic>
+          </wp:inline>
+        </w:drawing>
+      </w:r>
+    </w:p>
+    <w:p>
+      <w:pPr>
+        <w:jc w:val="center"/>
+      </w:pPr>
+      <w:r>
+        <w:rPr>
+          <w:i/>
+          <w:sz w:val="18"/>
+        </w:rPr>
+        <w:t>Las cinco islas típicas de un banco regional — central, agencias, contabilidad, promotores, reporting — cada una con su tecnología y su vocabulario. WQuestions no reemplaza ninguna; cada una publica sus hechos al grafo común con su dialecto mapeado al catálogo D7 una sola vez. El archipiélago se vuelve consultable sin disolverse.</w:t>
+      </w:r>
+    </w:p>
+    <w:p>
+      <w:r>
+        <w:rPr>
+          <w:b w:val="0"/>
+          <w:i w:val="0"/>
+          <w:u w:val="none"/>
+        </w:rPr>
+        <w:t xml:space="preserve">Esta es, probablemente, la propuesta más ambiciosa del libro y la menos trivial de adoptar. Pero a diferencia de los proyectos tradicionales de centralización, </w:t>
+      </w:r>
+      <w:r>
+        <w:rPr>
+          <w:b/>
+          <w:i w:val="0"/>
+          <w:u w:val="none"/>
+        </w:rPr>
+        <w:t>no exige que las islas se rindan</w:t>
+      </w:r>
+      <w:r>
+        <w:rPr>
+          <w:b w:val="0"/>
+          <w:i w:val="0"/>
+          <w:u w:val="none"/>
+        </w:rPr>
+        <w:t>. Solo exige que digan, en el vocabulario común, lo que están haciendo. La isla sigue siendo isla; el archipiélago se vuelve consultable.</w:t>
+      </w:r>
+    </w:p>
+    <w:p>
+      <w:pPr>
+        <w:pStyle w:val="Heading2"/>
+      </w:pPr>
+      <w:r>
+        <w:t>Un mapa del dominio</w:t>
+      </w:r>
+    </w:p>
+    <w:p>
+      <w:r>
+        <w:rPr>
+          <w:b w:val="0"/>
+          <w:i w:val="0"/>
+          <w:u w:val="none"/>
+        </w:rPr>
+        <w:t xml:space="preserve">Lo primero al abordar un banco es resistir la urgencia de bajar a detalle. El alto nivel importa porque el banco tiene </w:t>
+      </w:r>
+      <w:r>
+        <w:rPr>
+          <w:b/>
+          <w:i w:val="0"/>
+          <w:u w:val="none"/>
+        </w:rPr>
+        <w:t>muchas familias de entidades a la vez</w:t>
+      </w:r>
+      <w:r>
+        <w:rPr>
+          <w:b w:val="0"/>
+          <w:i w:val="0"/>
+          <w:u w:val="none"/>
+        </w:rPr>
+        <w:t>:</w:t>
+      </w:r>
+    </w:p>
+    <w:p>
+      <w:r>
+        <w:rPr>
+          <w:b/>
+          <w:i w:val="0"/>
+          <w:u w:val="none"/>
+        </w:rPr>
+        <w:t>Q — agentes.</w:t>
+      </w:r>
+      <w:r>
+        <w:rPr>
+          <w:b w:val="0"/>
+          <w:i w:val="0"/>
+          <w:u w:val="none"/>
+        </w:rPr>
+        <w:t xml:space="preserve"> Tres clases bien distintas. (1) Personas físicas: clientes retail, empleados, ejecutivos de cuenta. (2) Personas jurídicas: empresas clientes, corresponsales, regulador, procesadores (Visa, Mastercard), partners. (3) Sistemas con agencia (D5): el motor de scoring, el sistema antifraude, los autorizadores de tarjeta, los robots de cobranza. Los tres tipos entran a Q sin distinción especial — el modelo trata uniformemente a un humano y a un autorizador automático.</w:t>
+      </w:r>
+    </w:p>
+    <w:p>
+      <w:r>
+        <w:rPr>
+          <w:b/>
+          <w:i w:val="0"/>
+          <w:u w:val="none"/>
+        </w:rPr>
+        <w:t>O — entidades situadas.</w:t>
+      </w:r>
+      <w:r>
+        <w:rPr>
+          <w:b w:val="0"/>
+          <w:i w:val="0"/>
+          <w:u w:val="none"/>
+        </w:rPr>
+        <w:t xml:space="preserve"> Acá está el grueso del dominio. (1) Cuentas: corrientes, ahorros, plazo fijo, cuenta sueldo, cuenta corporativa, cuenta en moneda extranjera. (2) Productos crediticios: préstamos personales, hipotecarios, vehiculares, tarjetas de crédito, líneas comerciales, créditos por planilla. (3) Movimientos: cada depósito, retiro, transferencia, pago, cargo, abono. (4) Asientos contables: cada movimiento operativo tiene su contrapartida en cuentas de balance. (5) Productos como ofertas reificadas: </w:t>
+      </w:r>
+      <w:r>
+        <w:rPr>
+          <w:b w:val="0"/>
+          <w:i/>
+          <w:u w:val="none"/>
+        </w:rPr>
+        <w:t>"Tarjeta Visa Platinum"</w:t>
+      </w:r>
+      <w:r>
+        <w:rPr>
+          <w:b w:val="0"/>
+          <w:i w:val="0"/>
+          <w:u w:val="none"/>
+        </w:rPr>
+        <w:t xml:space="preserve">, </w:t>
+      </w:r>
+      <w:r>
+        <w:rPr>
+          <w:b w:val="0"/>
+          <w:i/>
+          <w:u w:val="none"/>
+        </w:rPr>
+        <w:t>"Préstamo Hipotecario Tasa Fija 15 años"</w:t>
+      </w:r>
+      <w:r>
+        <w:rPr>
+          <w:b w:val="0"/>
+          <w:i w:val="0"/>
+          <w:u w:val="none"/>
+        </w:rPr>
+        <w:t xml:space="preserve"> — son entidades del catálogo comercial del banco, no categorías abstractas. (6) Investigaciones de fraude, reclamos, gestiones de cobranza, ajustes contables.</w:t>
+      </w:r>
+    </w:p>
+    <w:p>
+      <w:r>
+        <w:rPr>
+          <w:b/>
+          <w:i w:val="0"/>
+          <w:u w:val="none"/>
+        </w:rPr>
+        <w:t>L — lugares.</w:t>
+      </w:r>
+      <w:r>
+        <w:rPr>
+          <w:b w:val="0"/>
+          <w:i w:val="0"/>
+          <w:u w:val="none"/>
+        </w:rPr>
+        <w:t xml:space="preserve"> Sedes (casa matriz, sucursales urbanas, agencias del interior), ATMs, canales digitales (web banking, mobile, USSD), puntos de venta (POS) de la red. Cada operación tiene un canal — y eso es L. Un préstamo desembolsado en sucursal vs uno originado por web banking son operativamente distintos.</w:t>
+      </w:r>
+    </w:p>
+    <w:p>
+      <w:r>
+        <w:rPr>
+          <w:b/>
+          <w:i w:val="0"/>
+          <w:u w:val="none"/>
+        </w:rPr>
+        <w:t>T — momentos.</w:t>
+      </w:r>
+      <w:r>
+        <w:rPr>
+          <w:b w:val="0"/>
+          <w:i w:val="0"/>
+          <w:u w:val="none"/>
+        </w:rPr>
+        <w:t xml:space="preserve"> Triple registro: el momento del evento operativo (cuándo ocurrió la transacción en la realidad), el momento del registro contable (cuándo se asentó), el momento de cierre (cuándo se cerró el período). La diferencia entre los tres es lo que la auditoría interna persigue.</w:t>
+      </w:r>
+    </w:p>
+    <w:p>
+      <w:r>
+        <w:rPr>
+          <w:b/>
+          <w:i w:val="0"/>
+          <w:u w:val="none"/>
+        </w:rPr>
+        <w:t>N — cantidades.</w:t>
+      </w:r>
+      <w:r>
+        <w:rPr>
+          <w:b w:val="0"/>
+          <w:i w:val="0"/>
+          <w:u w:val="none"/>
+        </w:rPr>
+        <w:t xml:space="preserve"> Importes en distintas monedas, tasas, plazos, scores de riesgo. Cada N con su unidad K — y acá las unidades son críticas: confundir USD con EUR es el equivalente bancario al </w:t>
+      </w:r>
+      <w:r>
+        <w:rPr>
+          <w:b w:val="0"/>
+          <w:i/>
+          <w:u w:val="none"/>
+        </w:rPr>
+        <w:t>Mars Climate Orbiter</w:t>
+      </w:r>
+      <w:r>
+        <w:rPr>
+          <w:b w:val="0"/>
+          <w:i w:val="0"/>
+          <w:u w:val="none"/>
+        </w:rPr>
+        <w:t xml:space="preserve"> citado en el capítulo 6.</w:t>
+      </w:r>
+    </w:p>
+    <w:p>
+      <w:r>
+        <w:rPr>
+          <w:b/>
+          <w:i w:val="0"/>
+          <w:u w:val="none"/>
+        </w:rPr>
+        <w:t>K — categorías.</w:t>
+      </w:r>
+      <w:r>
+        <w:rPr>
+          <w:b w:val="0"/>
+          <w:i w:val="0"/>
+          <w:u w:val="none"/>
+        </w:rPr>
         <w:t xml:space="preserve"> El catálogo es enorme: tipos de cuenta, tipos de movimiento contable (códigos de transacción), monedas, segmentos de cliente, grados de riesgo, niveles de KYC, estados de un préstamo (vigente, mora, judicializado, castigado), códigos regulatorios. La política liberal del modelo brilla acá: cada banco extiende K con sus propias categorías sin tocar el catálogo D7.</w:t>
       </w:r>
     </w:p>
@@ -358,7 +1187,7 @@
         <w:drawing>
           <wp:inline xmlns:a="http://schemas.openxmlformats.org/drawingml/2006/main" xmlns:pic="http://schemas.openxmlformats.org/drawingml/2006/picture">
             <wp:extent cx="5486400" cy="3270069"/>
-            <wp:docPr id="1" name="Picture 1"/>
+            <wp:docPr id="2" name="Picture 2"/>
             <wp:cNvGraphicFramePr>
               <a:graphicFrameLocks noChangeAspect="1"/>
             </wp:cNvGraphicFramePr>
@@ -370,7 +1199,7 @@
                     <pic:cNvPicPr/>
                   </pic:nvPicPr>
                   <pic:blipFill>
-                    <a:blip r:embed="rId9"/>
+                    <a:blip r:embed="rId10"/>
                     <a:stretch>
                       <a:fillRect/>
                     </a:stretch>
@@ -2328,7 +3157,7 @@
         <w:drawing>
           <wp:inline xmlns:a="http://schemas.openxmlformats.org/drawingml/2006/main" xmlns:pic="http://schemas.openxmlformats.org/drawingml/2006/picture">
             <wp:extent cx="5486400" cy="3143371"/>
-            <wp:docPr id="2" name="Picture 2"/>
+            <wp:docPr id="3" name="Picture 3"/>
             <wp:cNvGraphicFramePr>
               <a:graphicFrameLocks noChangeAspect="1"/>
             </wp:cNvGraphicFramePr>
@@ -2340,7 +3169,7 @@
                     <pic:cNvPicPr/>
                   </pic:nvPicPr>
                   <pic:blipFill>
-                    <a:blip r:embed="rId10"/>
+                    <a:blip r:embed="rId11"/>
                     <a:stretch>
                       <a:fillRect/>
                     </a:stretch>

</xml_diff>